<commit_message>
Ampliar capturas del manual de usuario
</commit_message>
<xml_diff>
--- a/Documentos/ManualUsuario_MediaNest.docx
+++ b/Documentos/ManualUsuario_MediaNest.docx
@@ -1171,19 +1171,6 @@
     </w:p>
     <w:p>
       <w:pPr>
-        <w:pStyle w:val="Heading1"/>
-        <w:jc w:val="left"/>
-      </w:pPr>
-      <w:r>
-        <w:rPr>
-          <w:b w:val="0"/>
-          <w:i w:val="0"/>
-        </w:rPr>
-        <w:t>5. Buscar y abrir contenido</w:t>
-      </w:r>
-    </w:p>
-    <w:p>
-      <w:pPr>
         <w:pStyle w:val="Heading2"/>
         <w:jc w:val="left"/>
       </w:pPr>
@@ -1192,82 +1179,22 @@
           <w:b w:val="0"/>
           <w:i w:val="0"/>
         </w:rPr>
-        <w:t>5.1 Realizar una búsqueda</w:t>
-      </w:r>
-    </w:p>
-    <w:p>
-      <w:pPr>
-        <w:spacing w:line="276" w:lineRule="auto" w:after="100"/>
-        <w:jc w:val="both"/>
-      </w:pPr>
-      <w:r>
-        <w:rPr>
-          <w:rFonts w:ascii="Arial" w:hAnsi="Arial"/>
-          <w:b w:val="0"/>
-          <w:i w:val="0"/>
-          <w:sz w:val="22"/>
-        </w:rPr>
-        <w:t>• Abra Buscar desde el menú o seleccione el campo Buscar en internet.</w:t>
-      </w:r>
-    </w:p>
-    <w:p>
-      <w:pPr>
-        <w:spacing w:line="276" w:lineRule="auto" w:after="100"/>
-        <w:jc w:val="both"/>
-      </w:pPr>
-      <w:r>
-        <w:rPr>
-          <w:rFonts w:ascii="Arial" w:hAnsi="Arial"/>
-          <w:b w:val="0"/>
-          <w:i w:val="0"/>
-          <w:sz w:val="22"/>
-        </w:rPr>
-        <w:t>• Escriba el título, artista o palabra relacionada con el contenido deseado.</w:t>
-      </w:r>
-    </w:p>
-    <w:p>
-      <w:pPr>
-        <w:spacing w:line="276" w:lineRule="auto" w:after="100"/>
-        <w:jc w:val="both"/>
-      </w:pPr>
-      <w:r>
-        <w:rPr>
-          <w:rFonts w:ascii="Arial" w:hAnsi="Arial"/>
-          <w:b w:val="0"/>
-          <w:i w:val="0"/>
-          <w:sz w:val="22"/>
-        </w:rPr>
-        <w:t>• Seleccione Buscar con OK/Enter.</w:t>
-      </w:r>
-    </w:p>
-    <w:p>
-      <w:pPr>
-        <w:spacing w:line="276" w:lineRule="auto" w:after="100"/>
-        <w:jc w:val="both"/>
-      </w:pPr>
-      <w:r>
-        <w:rPr>
-          <w:rFonts w:ascii="Arial" w:hAnsi="Arial"/>
-          <w:b w:val="0"/>
-          <w:i w:val="0"/>
-          <w:sz w:val="22"/>
-        </w:rPr>
-        <w:t>• Elija el filtro Todas, Películas, Series o Música si desea limitar el resultado.</w:t>
-      </w:r>
-    </w:p>
-    <w:p>
-      <w:pPr>
-        <w:spacing w:line="276" w:lineRule="auto" w:after="100"/>
-        <w:jc w:val="both"/>
-      </w:pPr>
-      <w:r>
-        <w:rPr>
-          <w:rFonts w:ascii="Arial" w:hAnsi="Arial"/>
-          <w:b w:val="0"/>
-          <w:i w:val="0"/>
-          <w:sz w:val="22"/>
-        </w:rPr>
-        <w:t>• Seleccione una tarjeta para consultar su ficha.</w:t>
+        <w:t>4.3 Explorar películas, series y música</w:t>
+      </w:r>
+    </w:p>
+    <w:p>
+      <w:pPr>
+        <w:spacing w:line="276" w:lineRule="auto" w:after="100"/>
+        <w:jc w:val="both"/>
+      </w:pPr>
+      <w:r>
+        <w:rPr>
+          <w:rFonts w:ascii="Arial" w:hAnsi="Arial"/>
+          <w:b w:val="0"/>
+          <w:i w:val="0"/>
+          <w:sz w:val="22"/>
+        </w:rPr>
+        <w:t>Seleccione una sección desde el menú para cambiar la categoría activa. Películas reúne cortometrajes abiertos; Series muestra temporadas y episodios de prueba; Música consulta o presenta contenido de audio. La barra de filtros también permite cambiar de tipo sin salir de la pantalla principal.</w:t>
       </w:r>
     </w:p>
     <w:p>
@@ -1286,7 +1213,7 @@
               <a:graphicData uri="http://schemas.openxmlformats.org/drawingml/2006/picture">
                 <pic:pic>
                   <pic:nvPicPr>
-                    <pic:cNvPr id="0" name="captura_busqueda.png"/>
+                    <pic:cNvPr id="0" name="captura_peliculas.png"/>
                     <pic:cNvPicPr/>
                   </pic:nvPicPr>
                   <pic:blipFill>
@@ -1321,7 +1248,128 @@
           <w:i w:val="0"/>
           <w:sz w:val="22"/>
         </w:rPr>
-        <w:t>Figura U5. Buscador real y filtros de tipo; el recuadro indica dónde escribir y ejecutar la consulta.</w:t>
+        <w:t>Figura U5. Vista real de la sección Películas.</w:t>
+      </w:r>
+    </w:p>
+    <w:p>
+      <w:pPr>
+        <w:jc w:val="center"/>
+      </w:pPr>
+      <w:r>
+        <w:drawing>
+          <wp:inline>
+            <wp:extent cx="5760720" cy="3240405"/>
+            <wp:docPr id="7" name="Picture 7"/>
+            <wp:cNvGraphicFramePr>
+              <a:graphicFrameLocks noChangeAspect="1"/>
+            </wp:cNvGraphicFramePr>
+            <a:graphic>
+              <a:graphicData uri="http://schemas.openxmlformats.org/drawingml/2006/picture">
+                <pic:pic>
+                  <pic:nvPicPr>
+                    <pic:cNvPr id="0" name="captura_series.png"/>
+                    <pic:cNvPicPr/>
+                  </pic:nvPicPr>
+                  <pic:blipFill>
+                    <a:blip r:embed="rId51"/>
+                    <a:stretch>
+                      <a:fillRect/>
+                    </a:stretch>
+                  </pic:blipFill>
+                  <pic:spPr>
+                    <a:xfrm>
+                      <a:off x="0" y="0"/>
+                      <a:ext cx="5760720" cy="3240405"/>
+                    </a:xfrm>
+                    <a:prstGeom prst="rect"/>
+                  </pic:spPr>
+                </pic:pic>
+              </a:graphicData>
+            </a:graphic>
+          </wp:inline>
+        </w:drawing>
+      </w:r>
+    </w:p>
+    <w:p>
+      <w:pPr>
+        <w:spacing w:line="276" w:lineRule="auto" w:after="100"/>
+        <w:jc w:val="center"/>
+      </w:pPr>
+      <w:r>
+        <w:rPr>
+          <w:rFonts w:ascii="Arial" w:hAnsi="Arial"/>
+          <w:b/>
+          <w:i w:val="0"/>
+          <w:sz w:val="22"/>
+        </w:rPr>
+        <w:t>Figura U6. Vista real de la sección Series.</w:t>
+      </w:r>
+    </w:p>
+    <w:p>
+      <w:pPr>
+        <w:jc w:val="center"/>
+      </w:pPr>
+      <w:r>
+        <w:drawing>
+          <wp:inline>
+            <wp:extent cx="5760720" cy="3240405"/>
+            <wp:docPr id="8" name="Picture 8"/>
+            <wp:cNvGraphicFramePr>
+              <a:graphicFrameLocks noChangeAspect="1"/>
+            </wp:cNvGraphicFramePr>
+            <a:graphic>
+              <a:graphicData uri="http://schemas.openxmlformats.org/drawingml/2006/picture">
+                <pic:pic>
+                  <pic:nvPicPr>
+                    <pic:cNvPr id="0" name="captura_musica.png"/>
+                    <pic:cNvPicPr/>
+                  </pic:nvPicPr>
+                  <pic:blipFill>
+                    <a:blip r:embed="rId52"/>
+                    <a:stretch>
+                      <a:fillRect/>
+                    </a:stretch>
+                  </pic:blipFill>
+                  <pic:spPr>
+                    <a:xfrm>
+                      <a:off x="0" y="0"/>
+                      <a:ext cx="5760720" cy="3240405"/>
+                    </a:xfrm>
+                    <a:prstGeom prst="rect"/>
+                  </pic:spPr>
+                </pic:pic>
+              </a:graphicData>
+            </a:graphic>
+          </wp:inline>
+        </w:drawing>
+      </w:r>
+    </w:p>
+    <w:p>
+      <w:pPr>
+        <w:spacing w:line="276" w:lineRule="auto" w:after="100"/>
+        <w:jc w:val="center"/>
+      </w:pPr>
+      <w:r>
+        <w:rPr>
+          <w:rFonts w:ascii="Arial" w:hAnsi="Arial"/>
+          <w:b/>
+          <w:i w:val="0"/>
+          <w:sz w:val="22"/>
+        </w:rPr>
+        <w:t>Figura U7. Vista real de la sección Música.</w:t>
+      </w:r>
+    </w:p>
+    <w:p>
+      <w:pPr>
+        <w:pStyle w:val="Heading1"/>
+        <w:jc w:val="left"/>
+      </w:pPr>
+      <w:r>
+        <w:rPr>
+          <w:b w:val="0"/>
+          <w:i w:val="0"/>
+        </w:rPr>
+        <w:t>5. Buscar y abrir contenido</w:t>
       </w:r>
     </w:p>
     <w:p>
@@ -1334,6 +1382,148 @@
           <w:b w:val="0"/>
           <w:i w:val="0"/>
         </w:rPr>
+        <w:t>5.1 Realizar una búsqueda</w:t>
+      </w:r>
+    </w:p>
+    <w:p>
+      <w:pPr>
+        <w:spacing w:line="276" w:lineRule="auto" w:after="100"/>
+        <w:jc w:val="both"/>
+      </w:pPr>
+      <w:r>
+        <w:rPr>
+          <w:rFonts w:ascii="Arial" w:hAnsi="Arial"/>
+          <w:b w:val="0"/>
+          <w:i w:val="0"/>
+          <w:sz w:val="22"/>
+        </w:rPr>
+        <w:t>• Abra Buscar desde el menú o seleccione el campo Buscar en internet.</w:t>
+      </w:r>
+    </w:p>
+    <w:p>
+      <w:pPr>
+        <w:spacing w:line="276" w:lineRule="auto" w:after="100"/>
+        <w:jc w:val="both"/>
+      </w:pPr>
+      <w:r>
+        <w:rPr>
+          <w:rFonts w:ascii="Arial" w:hAnsi="Arial"/>
+          <w:b w:val="0"/>
+          <w:i w:val="0"/>
+          <w:sz w:val="22"/>
+        </w:rPr>
+        <w:t>• Escriba el título, artista o palabra relacionada con el contenido deseado.</w:t>
+      </w:r>
+    </w:p>
+    <w:p>
+      <w:pPr>
+        <w:spacing w:line="276" w:lineRule="auto" w:after="100"/>
+        <w:jc w:val="both"/>
+      </w:pPr>
+      <w:r>
+        <w:rPr>
+          <w:rFonts w:ascii="Arial" w:hAnsi="Arial"/>
+          <w:b w:val="0"/>
+          <w:i w:val="0"/>
+          <w:sz w:val="22"/>
+        </w:rPr>
+        <w:t>• Seleccione Buscar con OK/Enter.</w:t>
+      </w:r>
+    </w:p>
+    <w:p>
+      <w:pPr>
+        <w:spacing w:line="276" w:lineRule="auto" w:after="100"/>
+        <w:jc w:val="both"/>
+      </w:pPr>
+      <w:r>
+        <w:rPr>
+          <w:rFonts w:ascii="Arial" w:hAnsi="Arial"/>
+          <w:b w:val="0"/>
+          <w:i w:val="0"/>
+          <w:sz w:val="22"/>
+        </w:rPr>
+        <w:t>• Elija el filtro Todas, Películas, Series o Música si desea limitar el resultado.</w:t>
+      </w:r>
+    </w:p>
+    <w:p>
+      <w:pPr>
+        <w:spacing w:line="276" w:lineRule="auto" w:after="100"/>
+        <w:jc w:val="both"/>
+      </w:pPr>
+      <w:r>
+        <w:rPr>
+          <w:rFonts w:ascii="Arial" w:hAnsi="Arial"/>
+          <w:b w:val="0"/>
+          <w:i w:val="0"/>
+          <w:sz w:val="22"/>
+        </w:rPr>
+        <w:t>• Seleccione una tarjeta para consultar su ficha.</w:t>
+      </w:r>
+    </w:p>
+    <w:p>
+      <w:pPr>
+        <w:jc w:val="center"/>
+      </w:pPr>
+      <w:r>
+        <w:drawing>
+          <wp:inline>
+            <wp:extent cx="5760720" cy="3240405"/>
+            <wp:docPr id="9" name="Picture 9"/>
+            <wp:cNvGraphicFramePr>
+              <a:graphicFrameLocks noChangeAspect="1"/>
+            </wp:cNvGraphicFramePr>
+            <a:graphic>
+              <a:graphicData uri="http://schemas.openxmlformats.org/drawingml/2006/picture">
+                <pic:pic>
+                  <pic:nvPicPr>
+                    <pic:cNvPr id="0" name="captura_busqueda.png"/>
+                    <pic:cNvPicPr/>
+                  </pic:nvPicPr>
+                  <pic:blipFill>
+                    <a:blip r:embed="rId53"/>
+                    <a:stretch>
+                      <a:fillRect/>
+                    </a:stretch>
+                  </pic:blipFill>
+                  <pic:spPr>
+                    <a:xfrm>
+                      <a:off x="0" y="0"/>
+                      <a:ext cx="5760720" cy="3240405"/>
+                    </a:xfrm>
+                    <a:prstGeom prst="rect"/>
+                  </pic:spPr>
+                </pic:pic>
+              </a:graphicData>
+            </a:graphic>
+          </wp:inline>
+        </w:drawing>
+      </w:r>
+    </w:p>
+    <w:p>
+      <w:pPr>
+        <w:spacing w:line="276" w:lineRule="auto" w:after="100"/>
+        <w:jc w:val="center"/>
+      </w:pPr>
+      <w:r>
+        <w:rPr>
+          <w:rFonts w:ascii="Arial" w:hAnsi="Arial"/>
+          <w:b/>
+          <w:i w:val="0"/>
+          <w:sz w:val="22"/>
+        </w:rPr>
+        <w:t>Figura U8. Buscador real y filtros de tipo; el recuadro indica dónde escribir y ejecutar la consulta.</w:t>
+      </w:r>
+    </w:p>
+    <w:p>
+      <w:pPr>
+        <w:pStyle w:val="Heading2"/>
+        <w:jc w:val="left"/>
+      </w:pPr>
+      <w:r>
+        <w:rPr>
+          <w:b w:val="0"/>
+          <w:i w:val="0"/>
+        </w:rPr>
         <w:t>5.2 Leer la ficha de contenido</w:t>
       </w:r>
     </w:p>
@@ -1350,6 +1540,60 @@
           <w:sz w:val="22"/>
         </w:rPr>
         <w:t>Al abrir una tarjeta, MediaNest presenta el título, tipo, año o duración, clasificación, géneros y descripción. En las series se muestra la lista de episodios. Use Reproducir para iniciar, Guardar para añadirlo a Mi espacio y Cerrar o BACK para regresar al catálogo.</w:t>
+      </w:r>
+    </w:p>
+    <w:p>
+      <w:pPr>
+        <w:jc w:val="center"/>
+      </w:pPr>
+      <w:r>
+        <w:drawing>
+          <wp:inline>
+            <wp:extent cx="5760720" cy="3240405"/>
+            <wp:docPr id="10" name="Picture 10"/>
+            <wp:cNvGraphicFramePr>
+              <a:graphicFrameLocks noChangeAspect="1"/>
+            </wp:cNvGraphicFramePr>
+            <a:graphic>
+              <a:graphicData uri="http://schemas.openxmlformats.org/drawingml/2006/picture">
+                <pic:pic>
+                  <pic:nvPicPr>
+                    <pic:cNvPr id="0" name="captura_detalle_pelicula.png"/>
+                    <pic:cNvPicPr/>
+                  </pic:nvPicPr>
+                  <pic:blipFill>
+                    <a:blip r:embed="rId54"/>
+                    <a:stretch>
+                      <a:fillRect/>
+                    </a:stretch>
+                  </pic:blipFill>
+                  <pic:spPr>
+                    <a:xfrm>
+                      <a:off x="0" y="0"/>
+                      <a:ext cx="5760720" cy="3240405"/>
+                    </a:xfrm>
+                    <a:prstGeom prst="rect"/>
+                  </pic:spPr>
+                </pic:pic>
+              </a:graphicData>
+            </a:graphic>
+          </wp:inline>
+        </w:drawing>
+      </w:r>
+    </w:p>
+    <w:p>
+      <w:pPr>
+        <w:spacing w:line="276" w:lineRule="auto" w:after="100"/>
+        <w:jc w:val="center"/>
+      </w:pPr>
+      <w:r>
+        <w:rPr>
+          <w:rFonts w:ascii="Arial" w:hAnsi="Arial"/>
+          <w:b/>
+          <w:i w:val="0"/>
+          <w:sz w:val="22"/>
+        </w:rPr>
+        <w:t>Figura U9. Ficha de película de MediaNest con acciones Reproducir, Guardar y Cerrar.</w:t>
       </w:r>
     </w:p>
     <w:p>
@@ -1644,6 +1888,60 @@
       </w:tr>
     </w:tbl>
     <w:p/>
+    <w:p>
+      <w:pPr>
+        <w:jc w:val="center"/>
+      </w:pPr>
+      <w:r>
+        <w:drawing>
+          <wp:inline>
+            <wp:extent cx="5760720" cy="3240405"/>
+            <wp:docPr id="11" name="Picture 11"/>
+            <wp:cNvGraphicFramePr>
+              <a:graphicFrameLocks noChangeAspect="1"/>
+            </wp:cNvGraphicFramePr>
+            <a:graphic>
+              <a:graphicData uri="http://schemas.openxmlformats.org/drawingml/2006/picture">
+                <pic:pic>
+                  <pic:nvPicPr>
+                    <pic:cNvPr id="0" name="captura_reproductor_musica.png"/>
+                    <pic:cNvPicPr/>
+                  </pic:nvPicPr>
+                  <pic:blipFill>
+                    <a:blip r:embed="rId55"/>
+                    <a:stretch>
+                      <a:fillRect/>
+                    </a:stretch>
+                  </pic:blipFill>
+                  <pic:spPr>
+                    <a:xfrm>
+                      <a:off x="0" y="0"/>
+                      <a:ext cx="5760720" cy="3240405"/>
+                    </a:xfrm>
+                    <a:prstGeom prst="rect"/>
+                  </pic:spPr>
+                </pic:pic>
+              </a:graphicData>
+            </a:graphic>
+          </wp:inline>
+        </w:drawing>
+      </w:r>
+    </w:p>
+    <w:p>
+      <w:pPr>
+        <w:spacing w:line="276" w:lineRule="auto" w:after="100"/>
+        <w:jc w:val="center"/>
+      </w:pPr>
+      <w:r>
+        <w:rPr>
+          <w:rFonts w:ascii="Arial" w:hAnsi="Arial"/>
+          <w:b/>
+          <w:i w:val="0"/>
+          <w:sz w:val="22"/>
+        </w:rPr>
+        <w:t>Figura U10. Interfaz del reproductor de música y controles disponibles.</w:t>
+      </w:r>
+    </w:p>
     <w:p>
       <w:pPr>
         <w:pStyle w:val="Heading2"/>

</xml_diff>